<commit_message>
feat(scale): integrate scale settings and usage context for inventory management
- Added API endpoint to fetch scale settings for venues.
- Enhanced InventoryViewModel to manage scale integration settings and context.
- Updated InventoryScreen to utilize scale settings during stock counting.
- Introduced new ScaleSettingsRepository for handling scale configuration data.
- Implemented scale connection management in ScaleCaptureViewModel with context-aware usage.
- Added UI components for displaying scale readings and handling scale connection states.
- Updated documentation to reflect new scale integration features and usage guidelines.
</commit_message>
<xml_diff>
--- a/docs/operacion/Guia-operativa-vales-por-area-Avoqado.docx
+++ b/docs/operacion/Guia-operativa-vales-por-area-Avoqado.docx
@@ -134,13 +134,7 @@
               <w:spacing w:before="0" w:after="100"/>
             </w:pPr>
             <w:r>
-              <w:rPr>
-                <w:rFonts w:ascii="Calibri" w:hAnsi="Calibri" w:eastAsia="Calibri"/>
-                <w:b/>
-                <w:color w:val="0B2545"/>
-                <w:sz w:val="21"/>
-              </w:rPr>
-              <w:t>1.0 · 29 de julio de 2026</w:t>
+              <w:t>1.1 · 30 de julio de 2026</w:t>
             </w:r>
           </w:p>
         </w:tc>
@@ -1546,43 +1540,7 @@
         <w:widowControl/>
       </w:pPr>
       <w:r>
-        <w:rPr>
-          <w:rFonts w:ascii="Calibri" w:hAnsi="Calibri" w:eastAsia="Calibri"/>
-          <w:sz w:val="22"/>
-        </w:rPr>
-        <w:t xml:space="preserve">captura el peso en </w:t>
-      </w:r>
-      <w:r>
-        <w:rPr>
-          <w:rFonts w:ascii="Calibri" w:hAnsi="Calibri" w:eastAsia="Calibri"/>
-          <w:b/>
-          <w:sz w:val="22"/>
-        </w:rPr>
-        <w:t>Peso (kg)</w:t>
-      </w:r>
-      <w:r>
-        <w:rPr>
-          <w:rFonts w:ascii="Calibri" w:hAnsi="Calibri" w:eastAsia="Calibri"/>
-          <w:sz w:val="22"/>
-        </w:rPr>
-        <w:t xml:space="preserve">, por ejemplo </w:t>
-      </w:r>
-      <w:r>
-        <w:rPr>
-          <w:rFonts w:ascii="Courier New" w:hAnsi="Courier New" w:eastAsia="Courier New"/>
-          <w:b/>
-          <w:color w:val="0B2545"/>
-          <w:sz w:val="19"/>
-          <w:shd w:fill="F2F4F7"/>
-        </w:rPr>
-        <w:t>0.435</w:t>
-      </w:r>
-      <w:r>
-        <w:rPr>
-          <w:rFonts w:ascii="Calibri" w:hAnsi="Calibri" w:eastAsia="Calibri"/>
-          <w:sz w:val="22"/>
-        </w:rPr>
-        <w:t>;</w:t>
+        <w:t>si aparece Báscula, espera el estado estable; Avoqado llenará el peso;</w:t>
       </w:r>
     </w:p>
     <w:p>
@@ -1597,11 +1555,7 @@
         <w:widowControl/>
       </w:pPr>
       <w:r>
-        <w:rPr>
-          <w:rFonts w:ascii="Calibri" w:hAnsi="Calibri" w:eastAsia="Calibri"/>
-          <w:sz w:val="22"/>
-        </w:rPr>
-        <w:t>revisa el precio por kilogramo y el total mostrado;</w:t>
+        <w:t>si no está conectada, pulsa Capturar manualmente y escribe el peso visible en Peso (kg);</w:t>
       </w:r>
     </w:p>
     <w:p>
@@ -1616,26 +1570,7 @@
         <w:widowControl/>
       </w:pPr>
       <w:r>
-        <w:rPr>
-          <w:rFonts w:ascii="Calibri" w:hAnsi="Calibri" w:eastAsia="Calibri"/>
-          <w:sz w:val="22"/>
-        </w:rPr>
-        <w:t xml:space="preserve">pulsa </w:t>
-      </w:r>
-      <w:r>
-        <w:rPr>
-          <w:rFonts w:ascii="Calibri" w:hAnsi="Calibri" w:eastAsia="Calibri"/>
-          <w:b/>
-          <w:sz w:val="22"/>
-        </w:rPr>
-        <w:t>Agregar • $…</w:t>
-      </w:r>
-      <w:r>
-        <w:rPr>
-          <w:rFonts w:ascii="Calibri" w:hAnsi="Calibri" w:eastAsia="Calibri"/>
-          <w:sz w:val="22"/>
-        </w:rPr>
-        <w:t>; el botón muestra el total calculado.</w:t>
+        <w:t>revisa el precio por kilogramo y el total, y pulsa Agregar • $…</w:t>
       </w:r>
     </w:p>
     <w:p>
@@ -2779,7 +2714,7 @@
         <w:widowControl/>
       </w:pPr>
       <w:r>
-        <w:t>Operación disponible desde el primer día</w:t>
+        <w:t>Cremería — Rhino BAR-8RS</w:t>
       </w:r>
     </w:p>
     <w:p>
@@ -2787,20 +2722,20 @@
         <w:keepNext/>
         <w:keepLines/>
         <w:widowControl/>
+        <w:numPr>
+          <w:ilvl w:val="0"/>
+          <w:numId w:val="18"/>
+        </w:numPr>
       </w:pPr>
       <w:r>
-        <w:rPr>
-          <w:rFonts w:ascii="Calibri" w:hAnsi="Calibri" w:eastAsia="Calibri"/>
-          <w:sz w:val="22"/>
-        </w:rPr>
-        <w:t>El flujo de vales funciona aunque una báscula no esté conectada a Avoqado. Mientras se certifica la lectura automática de cada modelo, el operador captura en la app el peso que muestra la báscula.</w:t>
+        <w:t>Entra a Cobrar y toca un producto configurado como Se vende por peso.</w:t>
       </w:r>
     </w:p>
     <w:p>
       <w:pPr>
         <w:numPr>
           <w:ilvl w:val="0"/>
-          <w:numId w:val="10"/>
+          <w:numId w:val="18"/>
         </w:numPr>
         <w:spacing w:after="80" w:line="300" w:lineRule="auto"/>
         <w:ind w:left="540" w:hanging="270"/>
@@ -2808,26 +2743,14 @@
         <w:widowControl/>
       </w:pPr>
       <w:r>
-        <w:rPr>
-          <w:rFonts w:ascii="Calibri" w:hAnsi="Calibri" w:eastAsia="Calibri"/>
-          <w:b/>
-          <w:sz w:val="22"/>
-        </w:rPr>
-        <w:t>Cremería — Rhino:</w:t>
-      </w:r>
-      <w:r>
-        <w:rPr>
-          <w:rFonts w:ascii="Calibri" w:hAnsi="Calibri" w:eastAsia="Calibri"/>
-          <w:sz w:val="22"/>
-        </w:rPr>
-        <w:t xml:space="preserve"> pesar el producto, esperar una lectura estable y capturar los kilogramos en Avoqado.</w:t>
+        <w:t>Coloca el producto y espera a que la tarjeta de báscula muestre una lectura estable.</w:t>
       </w:r>
     </w:p>
     <w:p>
       <w:pPr>
         <w:numPr>
           <w:ilvl w:val="0"/>
-          <w:numId w:val="10"/>
+          <w:numId w:val="18"/>
         </w:numPr>
         <w:spacing w:after="80" w:line="300" w:lineRule="auto"/>
         <w:ind w:left="540" w:hanging="270"/>
@@ -2835,32 +2758,139 @@
         <w:widowControl/>
       </w:pPr>
       <w:r>
-        <w:rPr>
-          <w:rFonts w:ascii="Calibri" w:hAnsi="Calibri" w:eastAsia="Calibri"/>
-          <w:b/>
-          <w:sz w:val="22"/>
-        </w:rPr>
-        <w:t>CEDIS — Justa LP7516:</w:t>
-      </w:r>
-      <w:r>
-        <w:rPr>
-          <w:rFonts w:ascii="Calibri" w:hAnsi="Calibri" w:eastAsia="Calibri"/>
-          <w:sz w:val="22"/>
-        </w:rPr>
-        <w:t xml:space="preserve"> usar para recepción, salida o conteo de inventario según el proceso configurado. No genera por sí sola un vale de venta de cremería.</w:t>
+        <w:t>Revisa cero o tara, kilogramos y total.</w:t>
       </w:r>
     </w:p>
     <w:p>
       <w:pPr>
         <w:keepLines/>
         <w:widowControl/>
+        <w:numPr>
+          <w:ilvl w:val="0"/>
+          <w:numId w:val="18"/>
+        </w:numPr>
       </w:pPr>
       <w:r>
-        <w:rPr>
-          <w:rFonts w:ascii="Calibri" w:hAnsi="Calibri" w:eastAsia="Calibri"/>
-          <w:sz w:val="22"/>
-        </w:rPr>
-        <w:t>Cuando la lectura automática sea habilitada para una báscula, el operador seguirá revisando tres cosas antes de aceptar el peso: cero o tara correcta, lectura estable y unidad en kilogramos. Si la lectura automática falla, se continúa con captura manual; caja y los vales no se detienen.</w:t>
+        <w:t>Pulsa Agregar. Si el cable o la lectura fallan, usa Capturar manualmente.</w:t>
+      </w:r>
+    </w:p>
+    <w:p>
+      <w:pPr>
+        <w:pStyle w:val="Heading3"/>
+        <w:keepNext/>
+        <w:keepLines/>
+        <w:widowControl/>
+      </w:pPr>
+      <w:r>
+        <w:t>CEDIS — Justa LP7516</w:t>
+      </w:r>
+    </w:p>
+    <w:p>
+      <w:pPr>
+        <w:numPr>
+          <w:ilvl w:val="0"/>
+          <w:numId w:val="19"/>
+        </w:numPr>
+        <w:spacing w:after="80" w:line="300" w:lineRule="auto"/>
+        <w:ind w:left="540" w:hanging="270"/>
+        <w:keepLines/>
+        <w:widowControl/>
+      </w:pPr>
+      <w:r>
+        <w:t>Entra a Inventario y abre Conteos.</w:t>
+      </w:r>
+    </w:p>
+    <w:p>
+      <w:pPr>
+        <w:numPr>
+          <w:ilvl w:val="0"/>
+          <w:numId w:val="19"/>
+        </w:numPr>
+        <w:spacing w:after="80" w:line="300" w:lineRule="auto"/>
+        <w:ind w:left="540" w:hanging="270"/>
+        <w:keepLines/>
+        <w:widowControl/>
+      </w:pPr>
+      <w:r>
+        <w:t>Inicia un conteo completo o cíclico.</w:t>
+      </w:r>
+    </w:p>
+    <w:p>
+      <w:pPr>
+        <w:numPr>
+          <w:ilvl w:val="0"/>
+          <w:numId w:val="19"/>
+        </w:numPr>
+        <w:spacing w:after="80" w:line="300" w:lineRule="auto"/>
+        <w:ind w:left="540" w:hanging="270"/>
+        <w:keepLines/>
+        <w:widowControl/>
+      </w:pPr>
+      <w:r>
+        <w:t>Selecciona un insumo cuya unidad sea kilogramo o gramo.</w:t>
+      </w:r>
+    </w:p>
+    <w:p>
+      <w:pPr>
+        <w:numPr>
+          <w:ilvl w:val="0"/>
+          <w:numId w:val="19"/>
+        </w:numPr>
+        <w:spacing w:after="80" w:line="300" w:lineRule="auto"/>
+        <w:ind w:left="540" w:hanging="270"/>
+        <w:keepLines/>
+        <w:widowControl/>
+      </w:pPr>
+      <w:r>
+        <w:t>Coloca el producto en la Justa y espera una lectura estable.</w:t>
+      </w:r>
+    </w:p>
+    <w:p>
+      <w:pPr>
+        <w:numPr>
+          <w:ilvl w:val="0"/>
+          <w:numId w:val="19"/>
+        </w:numPr>
+        <w:spacing w:after="80" w:line="300" w:lineRule="auto"/>
+        <w:ind w:left="540" w:hanging="270"/>
+        <w:keepLines/>
+        <w:widowControl/>
+      </w:pPr>
+      <w:r>
+        <w:t>Revisa el valor y pulsa Usar este peso. Avoqado llena el campo, pero no guarda sin tu confirmación.</w:t>
+      </w:r>
+    </w:p>
+    <w:p>
+      <w:pPr>
+        <w:numPr>
+          <w:ilvl w:val="0"/>
+          <w:numId w:val="19"/>
+        </w:numPr>
+        <w:spacing w:after="80" w:line="300" w:lineRule="auto"/>
+        <w:ind w:left="540" w:hanging="270"/>
+        <w:keepLines/>
+        <w:widowControl/>
+      </w:pPr>
+      <w:r>
+        <w:t>Continúa con Siguiente artículo y termina con Revisar conteo.</w:t>
+      </w:r>
+    </w:p>
+    <w:p>
+      <w:pPr>
+        <w:keepLines/>
+        <w:widowControl/>
+      </w:pPr>
+      <w:r>
+        <w:t>Para artículos en piezas, litros u otras unidades se usa el teclado normal. La recepción de órdenes de compra permanece manual en esta etapa.</w:t>
+      </w:r>
+    </w:p>
+    <w:p>
+      <w:pPr>
+        <w:keepLines/>
+        <w:widowControl/>
+      </w:pPr>
+      <w:r>
+        <w:t>En ambos lugares revisa cero o tara, lectura estable y unidad. Si la lectura automática falla, captura manualmente el peso visible; caja, vales e inventario no se detienen.</w:t>
       </w:r>
     </w:p>
     <w:p>
@@ -3743,28 +3773,7 @@
         <w:widowControl/>
       </w:pPr>
       <w:r>
-        <w:rPr>
-          <w:rFonts w:ascii="Calibri" w:hAnsi="Calibri" w:eastAsia="Calibri"/>
-          <w:sz w:val="22"/>
-        </w:rPr>
-        <w:t xml:space="preserve">Cremería pesa el jamón, captura </w:t>
-      </w:r>
-      <w:r>
-        <w:rPr>
-          <w:rFonts w:ascii="Courier New" w:hAnsi="Courier New" w:eastAsia="Courier New"/>
-          <w:b/>
-          <w:color w:val="0B2545"/>
-          <w:sz w:val="19"/>
-          <w:shd w:fill="F2F4F7"/>
-        </w:rPr>
-        <w:t>0.250 kg</w:t>
-      </w:r>
-      <w:r>
-        <w:rPr>
-          <w:rFonts w:ascii="Calibri" w:hAnsi="Calibri" w:eastAsia="Calibri"/>
-          <w:sz w:val="22"/>
-        </w:rPr>
-        <w:t>, emite su vale y conserva el jamón.</w:t>
+        <w:t>Cremería pesa el jamón, usa la lectura estable o captura 0.250 kg, emite su vale y conserva el jamón.</w:t>
       </w:r>
     </w:p>
     <w:p>
@@ -4610,6 +4619,18 @@
     </w:lvlOverride>
   </w:num>
   <w:num w:numId="17">
+    <w:abstractNumId w:val="10"/>
+    <w:lvlOverride w:ilvl="0">
+      <w:startOverride w:val="1"/>
+    </w:lvlOverride>
+  </w:num>
+  <w:num w:numId="18">
+    <w:abstractNumId w:val="10"/>
+    <w:lvlOverride w:ilvl="0">
+      <w:startOverride w:val="1"/>
+    </w:lvlOverride>
+  </w:num>
+  <w:num w:numId="19">
     <w:abstractNumId w:val="10"/>
     <w:lvlOverride w:ilvl="0">
       <w:startOverride w:val="1"/>

</xml_diff>